<commit_message>
feat: add workout api state and facade foundation
</commit_message>
<xml_diff>
--- a/MODERNIZATION_PROGRESS.docx
+++ b/MODERNIZATION_PROGRESS.docx
@@ -309,14 +309,14 @@
         <w:tc>
           <w:p>
             <w:r>
-              <w:t xml:space="preserve">Zapocto</w:t>
-            </w:r>
-          </w:p>
-        </w:tc>
-        <w:tc>
-          <w:p>
-            <w:r>
-              <w:t xml:space="preserve">Workout model i adapter postoje</w:t>
+              <w:t xml:space="preserve">U toku</w:t>
+            </w:r>
+          </w:p>
+        </w:tc>
+        <w:tc>
+          <w:p>
+            <w:r>
+              <w:t xml:space="preserve">DTO, adapter testovi, API servis i error handling postoje</w:t>
             </w:r>
           </w:p>
         </w:tc>
@@ -477,43 +477,67 @@
         </w:numPr>
       </w:pPr>
       <w:r>
-        <w:t xml:space="preserve">[ ] Definisati Workout, WorkoutExercise i WorkoutSet domain modele</w:t>
-      </w:r>
-    </w:p>
-    <w:p>
-      <w:pPr>
-        <w:pStyle w:val="ListParagraph"/>
-        <w:numPr>
-          <w:ilvl w:val="0"/>
-          <w:numId w:val="1"/>
-        </w:numPr>
-      </w:pPr>
-      <w:r>
-        <w:t xml:space="preserve">[ ] Odvojiti Firestore DTO od frontend domain modela</w:t>
-      </w:r>
-    </w:p>
-    <w:p>
-      <w:pPr>
-        <w:pStyle w:val="ListParagraph"/>
-        <w:numPr>
-          <w:ilvl w:val="0"/>
-          <w:numId w:val="1"/>
-        </w:numPr>
-      </w:pPr>
-      <w:r>
-        <w:t xml:space="preserve">[ ] Dodati i testirati adapter DTO &lt;-&gt; domain</w:t>
-      </w:r>
-    </w:p>
-    <w:p>
-      <w:pPr>
-        <w:pStyle w:val="ListParagraph"/>
-        <w:numPr>
-          <w:ilvl w:val="0"/>
-          <w:numId w:val="1"/>
-        </w:numPr>
-      </w:pPr>
-      <w:r>
-        <w:t xml:space="preserve">[ ] Izdvojiti API service, zatim WorkoutState i WorkoutFacade</w:t>
+        <w:t xml:space="preserve">[x] Definisati Workout, WorkoutExercise i WorkoutSet domain modele</w:t>
+      </w:r>
+    </w:p>
+    <w:p>
+      <w:pPr>
+        <w:pStyle w:val="ListParagraph"/>
+        <w:numPr>
+          <w:ilvl w:val="0"/>
+          <w:numId w:val="1"/>
+        </w:numPr>
+      </w:pPr>
+      <w:r>
+        <w:t xml:space="preserve">[x] Odvojiti Firestore DTO od frontend domain modela</w:t>
+      </w:r>
+    </w:p>
+    <w:p>
+      <w:pPr>
+        <w:pStyle w:val="ListParagraph"/>
+        <w:numPr>
+          <w:ilvl w:val="0"/>
+          <w:numId w:val="1"/>
+        </w:numPr>
+      </w:pPr>
+      <w:r>
+        <w:t xml:space="preserve">[x] Dodati i testirati adapter DTO &lt;-&gt; domain</w:t>
+      </w:r>
+    </w:p>
+    <w:p>
+      <w:pPr>
+        <w:pStyle w:val="ListParagraph"/>
+        <w:numPr>
+          <w:ilvl w:val="0"/>
+          <w:numId w:val="1"/>
+        </w:numPr>
+      </w:pPr>
+      <w:r>
+        <w:t xml:space="preserve">[x] Izdvojiti API service: WorkoutApiService</w:t>
+      </w:r>
+    </w:p>
+    <w:p>
+      <w:pPr>
+        <w:pStyle w:val="ListParagraph"/>
+        <w:numPr>
+          <w:ilvl w:val="0"/>
+          <w:numId w:val="1"/>
+        </w:numPr>
+      </w:pPr>
+      <w:r>
+        <w:t xml:space="preserve">[x] Dodati API error handling kroz WorkoutApiError</w:t>
+      </w:r>
+    </w:p>
+    <w:p>
+      <w:pPr>
+        <w:pStyle w:val="ListParagraph"/>
+        <w:numPr>
+          <w:ilvl w:val="0"/>
+          <w:numId w:val="1"/>
+        </w:numPr>
+      </w:pPr>
+      <w:r>
+        <w:t xml:space="preserve">[ ] Povezati API service sa WorkoutState i WorkoutFacade</w:t>
       </w:r>
     </w:p>
     <w:p>

</xml_diff>

<commit_message>
docs: refresh modernization progress report
</commit_message>
<xml_diff>
--- a/MODERNIZATION_PROGRESS.docx
+++ b/MODERNIZATION_PROGRESS.docx
@@ -309,7 +309,7 @@
         <w:tc>
           <w:p>
             <w:r>
-              <w:t xml:space="preserve">U toku</w:t>
+              <w:t xml:space="preserve">Zavrseno</w:t>
             </w:r>
           </w:p>
         </w:tc>
@@ -332,14 +332,14 @@
         <w:tc>
           <w:p>
             <w:r>
-              <w:t xml:space="preserve">Nije zapoceto</w:t>
-            </w:r>
-          </w:p>
-        </w:tc>
-        <w:tc>
-          <w:p>
-            <w:r>
-              <w:t xml:space="preserve">Planirano za Week 4-5</w:t>
+              <w:t xml:space="preserve">U toku</w:t>
+            </w:r>
+          </w:p>
+        </w:tc>
+        <w:tc>
+          <w:p>
+            <w:r>
+              <w:t xml:space="preserve">WorkoutState i WorkoutFacade business flow postoje</w:t>
             </w:r>
           </w:p>
         </w:tc>
@@ -537,7 +537,31 @@
         </w:numPr>
       </w:pPr>
       <w:r>
-        <w:t xml:space="preserve">[ ] Povezati API service sa WorkoutState i WorkoutFacade</w:t>
+        <w:t xml:space="preserve">[x] Povezati API service sa WorkoutState i WorkoutFacade</w:t>
+      </w:r>
+    </w:p>
+    <w:p>
+      <w:pPr>
+        <w:pStyle w:val="ListParagraph"/>
+        <w:numPr>
+          <w:ilvl w:val="0"/>
+          <w:numId w:val="1"/>
+        </w:numPr>
+      </w:pPr>
+      <w:r>
+        <w:t xml:space="preserve">[x] Implementirati create/update/delete/finish workout flow</w:t>
+      </w:r>
+    </w:p>
+    <w:p>
+      <w:pPr>
+        <w:pStyle w:val="ListParagraph"/>
+        <w:numPr>
+          <w:ilvl w:val="0"/>
+          <w:numId w:val="1"/>
+        </w:numPr>
+      </w:pPr>
+      <w:r>
+        <w:t xml:space="preserve">[ ] Dodati naprednije state transitions i facade business flow</w:t>
       </w:r>
     </w:p>
     <w:p>

</xml_diff>

<commit_message>
test: add workout facade coverage
</commit_message>
<xml_diff>
--- a/MODERNIZATION_PROGRESS.docx
+++ b/MODERNIZATION_PROGRESS.docx
@@ -561,6 +561,30 @@
         </w:numPr>
       </w:pPr>
       <w:r>
+        <w:t xml:space="preserve">[x] Dodati WorkoutState unit testove za signals i reset</w:t>
+      </w:r>
+    </w:p>
+    <w:p>
+      <w:pPr>
+        <w:pStyle w:val="ListParagraph"/>
+        <w:numPr>
+          <w:ilvl w:val="0"/>
+          <w:numId w:val="1"/>
+        </w:numPr>
+      </w:pPr>
+      <w:r>
+        <w:t xml:space="preserve">[x] Dodati WorkoutFacade unit testove za orchestration i error flow</w:t>
+      </w:r>
+    </w:p>
+    <w:p>
+      <w:pPr>
+        <w:pStyle w:val="ListParagraph"/>
+        <w:numPr>
+          <w:ilvl w:val="0"/>
+          <w:numId w:val="1"/>
+        </w:numPr>
+      </w:pPr>
+      <w:r>
         <w:t xml:space="preserve">[ ] Dodati naprednije state transitions i facade business flow</w:t>
       </w:r>
     </w:p>

</xml_diff>

<commit_message>
feat: connect training list to workout facade
</commit_message>
<xml_diff>
--- a/MODERNIZATION_PROGRESS.docx
+++ b/MODERNIZATION_PROGRESS.docx
@@ -585,6 +585,18 @@
         </w:numPr>
       </w:pPr>
       <w:r>
+        <w:t xml:space="preserve">[x] Povezati pocetno ucitavanje TrainingListComponent sa WorkoutFacade</w:t>
+      </w:r>
+    </w:p>
+    <w:p>
+      <w:pPr>
+        <w:pStyle w:val="ListParagraph"/>
+        <w:numPr>
+          <w:ilvl w:val="0"/>
+          <w:numId w:val="1"/>
+        </w:numPr>
+      </w:pPr>
+      <w:r>
         <w:t xml:space="preserve">[ ] Dodati naprednije state transitions i facade business flow</w:t>
       </w:r>
     </w:p>

</xml_diff>

<commit_message>
feat: route training delete through facade
</commit_message>
<xml_diff>
--- a/MODERNIZATION_PROGRESS.docx
+++ b/MODERNIZATION_PROGRESS.docx
@@ -597,6 +597,18 @@
         </w:numPr>
       </w:pPr>
       <w:r>
+        <w:t xml:space="preserve">[x] Prebaciti TrainingList delete/deactivate tok na WorkoutFacade</w:t>
+      </w:r>
+    </w:p>
+    <w:p>
+      <w:pPr>
+        <w:pStyle w:val="ListParagraph"/>
+        <w:numPr>
+          <w:ilvl w:val="0"/>
+          <w:numId w:val="1"/>
+        </w:numPr>
+      </w:pPr>
+      <w:r>
         <w:t xml:space="preserve">[ ] Dodati naprednije state transitions i facade business flow</w:t>
       </w:r>
     </w:p>

</xml_diff>

<commit_message>
refactor: remove legacy training list read path
</commit_message>
<xml_diff>
--- a/MODERNIZATION_PROGRESS.docx
+++ b/MODERNIZATION_PROGRESS.docx
@@ -609,6 +609,18 @@
         </w:numPr>
       </w:pPr>
       <w:r>
+        <w:t xml:space="preserve">[x] Ukloniti neiskorisceni direktni read tok iz TrainingListComponent</w:t>
+      </w:r>
+    </w:p>
+    <w:p>
+      <w:pPr>
+        <w:pStyle w:val="ListParagraph"/>
+        <w:numPr>
+          <w:ilvl w:val="0"/>
+          <w:numId w:val="1"/>
+        </w:numPr>
+      </w:pPr>
+      <w:r>
         <w:t xml:space="preserve">[ ] Dodati naprednije state transitions i facade business flow</w:t>
       </w:r>
     </w:p>

</xml_diff>

<commit_message>
feat: add workout query state signals
</commit_message>
<xml_diff>
--- a/MODERNIZATION_PROGRESS.docx
+++ b/MODERNIZATION_PROGRESS.docx
@@ -621,6 +621,18 @@
         </w:numPr>
       </w:pPr>
       <w:r>
+        <w:t xml:space="preserve">[x] Dodati WorkoutState Signals query state za search, sort i pagination</w:t>
+      </w:r>
+    </w:p>
+    <w:p>
+      <w:pPr>
+        <w:pStyle w:val="ListParagraph"/>
+        <w:numPr>
+          <w:ilvl w:val="0"/>
+          <w:numId w:val="1"/>
+        </w:numPr>
+      </w:pPr>
+      <w:r>
         <w:t xml:space="preserve">[ ] Dodati naprednije state transitions i facade business flow</w:t>
       </w:r>
     </w:p>

</xml_diff>

<commit_message>
update modernization progress documentation.
</commit_message>
<xml_diff>
--- a/MODERNIZATION_PROGRESS.docx
+++ b/MODERNIZATION_PROGRESS.docx
@@ -293,7 +293,7 @@
         <w:tc>
           <w:p>
             <w:r>
-              <w:t xml:space="preserve">HomeComponent je prvi migrirani feature</w:t>
+              <w:t xml:space="preserve">HomeComponent je migriran; ostali feature-i su prelazni</w:t>
             </w:r>
           </w:p>
         </w:tc>
@@ -339,7 +339,7 @@
         <w:tc>
           <w:p>
             <w:r>
-              <w:t xml:space="preserve">WorkoutState i WorkoutFacade business flow postoje</w:t>
+              <w:t xml:space="preserve">WorkoutState, query state i WorkoutFacade business flow postoje</w:t>
             </w:r>
           </w:p>
         </w:tc>
@@ -462,6 +462,54 @@
     </w:p>
     <w:p>
       <w:pPr>
+        <w:pStyle w:val="ListParagraph"/>
+        <w:numPr>
+          <w:ilvl w:val="0"/>
+          <w:numId w:val="1"/>
+        </w:numPr>
+      </w:pPr>
+      <w:r>
+        <w:t xml:space="preserve">[x] Login/auth tok prebacen na modularni Firebase provider setup</w:t>
+      </w:r>
+    </w:p>
+    <w:p>
+      <w:pPr>
+        <w:pStyle w:val="ListParagraph"/>
+        <w:numPr>
+          <w:ilvl w:val="0"/>
+          <w:numId w:val="1"/>
+        </w:numPr>
+      </w:pPr>
+      <w:r>
+        <w:t xml:space="preserve">[x] server.js prilagodjen Angular browser build outputu</w:t>
+      </w:r>
+    </w:p>
+    <w:p>
+      <w:pPr>
+        <w:pStyle w:val="ListParagraph"/>
+        <w:numPr>
+          <w:ilvl w:val="0"/>
+          <w:numId w:val="1"/>
+        </w:numPr>
+      </w:pPr>
+      <w:r>
+        <w:t xml:space="preserve">[x] TrainingList prikaz i akcije prebaceni na WorkoutFacade/WorkoutState</w:t>
+      </w:r>
+    </w:p>
+    <w:p>
+      <w:pPr>
+        <w:pStyle w:val="ListParagraph"/>
+        <w:numPr>
+          <w:ilvl w:val="0"/>
+          <w:numId w:val="1"/>
+        </w:numPr>
+      </w:pPr>
+      <w:r>
+        <w:t xml:space="preserve">[x] TrainingForm create/update tok prebacen na WorkoutFacade</w:t>
+      </w:r>
+    </w:p>
+    <w:p>
+      <w:pPr>
         <w:pStyle w:val="Heading1"/>
       </w:pPr>
       <w:r>
@@ -477,163 +525,43 @@
         </w:numPr>
       </w:pPr>
       <w:r>
-        <w:t xml:space="preserve">[x] Definisati Workout, WorkoutExercise i WorkoutSet domain modele</w:t>
-      </w:r>
-    </w:p>
-    <w:p>
-      <w:pPr>
-        <w:pStyle w:val="ListParagraph"/>
-        <w:numPr>
-          <w:ilvl w:val="0"/>
-          <w:numId w:val="1"/>
-        </w:numPr>
-      </w:pPr>
-      <w:r>
-        <w:t xml:space="preserve">[x] Odvojiti Firestore DTO od frontend domain modela</w:t>
-      </w:r>
-    </w:p>
-    <w:p>
-      <w:pPr>
-        <w:pStyle w:val="ListParagraph"/>
-        <w:numPr>
-          <w:ilvl w:val="0"/>
-          <w:numId w:val="1"/>
-        </w:numPr>
-      </w:pPr>
-      <w:r>
-        <w:t xml:space="preserve">[x] Dodati i testirati adapter DTO &lt;-&gt; domain</w:t>
-      </w:r>
-    </w:p>
-    <w:p>
-      <w:pPr>
-        <w:pStyle w:val="ListParagraph"/>
-        <w:numPr>
-          <w:ilvl w:val="0"/>
-          <w:numId w:val="1"/>
-        </w:numPr>
-      </w:pPr>
-      <w:r>
-        <w:t xml:space="preserve">[x] Izdvojiti API service: WorkoutApiService</w:t>
-      </w:r>
-    </w:p>
-    <w:p>
-      <w:pPr>
-        <w:pStyle w:val="ListParagraph"/>
-        <w:numPr>
-          <w:ilvl w:val="0"/>
-          <w:numId w:val="1"/>
-        </w:numPr>
-      </w:pPr>
-      <w:r>
-        <w:t xml:space="preserve">[x] Dodati API error handling kroz WorkoutApiError</w:t>
-      </w:r>
-    </w:p>
-    <w:p>
-      <w:pPr>
-        <w:pStyle w:val="ListParagraph"/>
-        <w:numPr>
-          <w:ilvl w:val="0"/>
-          <w:numId w:val="1"/>
-        </w:numPr>
-      </w:pPr>
-      <w:r>
-        <w:t xml:space="preserve">[x] Povezati API service sa WorkoutState i WorkoutFacade</w:t>
-      </w:r>
-    </w:p>
-    <w:p>
-      <w:pPr>
-        <w:pStyle w:val="ListParagraph"/>
-        <w:numPr>
-          <w:ilvl w:val="0"/>
-          <w:numId w:val="1"/>
-        </w:numPr>
-      </w:pPr>
-      <w:r>
-        <w:t xml:space="preserve">[x] Implementirati create/update/delete/finish workout flow</w:t>
-      </w:r>
-    </w:p>
-    <w:p>
-      <w:pPr>
-        <w:pStyle w:val="ListParagraph"/>
-        <w:numPr>
-          <w:ilvl w:val="0"/>
-          <w:numId w:val="1"/>
-        </w:numPr>
-      </w:pPr>
-      <w:r>
-        <w:t xml:space="preserve">[x] Dodati WorkoutState unit testove za signals i reset</w:t>
-      </w:r>
-    </w:p>
-    <w:p>
-      <w:pPr>
-        <w:pStyle w:val="ListParagraph"/>
-        <w:numPr>
-          <w:ilvl w:val="0"/>
-          <w:numId w:val="1"/>
-        </w:numPr>
-      </w:pPr>
-      <w:r>
-        <w:t xml:space="preserve">[x] Dodati WorkoutFacade unit testove za orchestration i error flow</w:t>
-      </w:r>
-    </w:p>
-    <w:p>
-      <w:pPr>
-        <w:pStyle w:val="ListParagraph"/>
-        <w:numPr>
-          <w:ilvl w:val="0"/>
-          <w:numId w:val="1"/>
-        </w:numPr>
-      </w:pPr>
-      <w:r>
-        <w:t xml:space="preserve">[x] Povezati pocetno ucitavanje TrainingListComponent sa WorkoutFacade</w:t>
-      </w:r>
-    </w:p>
-    <w:p>
-      <w:pPr>
-        <w:pStyle w:val="ListParagraph"/>
-        <w:numPr>
-          <w:ilvl w:val="0"/>
-          <w:numId w:val="1"/>
-        </w:numPr>
-      </w:pPr>
-      <w:r>
-        <w:t xml:space="preserve">[x] Prebaciti TrainingList delete/deactivate tok na WorkoutFacade</w:t>
-      </w:r>
-    </w:p>
-    <w:p>
-      <w:pPr>
-        <w:pStyle w:val="ListParagraph"/>
-        <w:numPr>
-          <w:ilvl w:val="0"/>
-          <w:numId w:val="1"/>
-        </w:numPr>
-      </w:pPr>
-      <w:r>
-        <w:t xml:space="preserve">[x] Ukloniti neiskorisceni direktni read tok iz TrainingListComponent</w:t>
-      </w:r>
-    </w:p>
-    <w:p>
-      <w:pPr>
-        <w:pStyle w:val="ListParagraph"/>
-        <w:numPr>
-          <w:ilvl w:val="0"/>
-          <w:numId w:val="1"/>
-        </w:numPr>
-      </w:pPr>
-      <w:r>
-        <w:t xml:space="preserve">[x] Dodati WorkoutState Signals query state za search, sort i pagination</w:t>
-      </w:r>
-    </w:p>
-    <w:p>
-      <w:pPr>
-        <w:pStyle w:val="ListParagraph"/>
-        <w:numPr>
-          <w:ilvl w:val="0"/>
-          <w:numId w:val="1"/>
-        </w:numPr>
-      </w:pPr>
-      <w:r>
-        <w:t xml:space="preserve">[ ] Dodati naprednije state transitions i facade business flow</w:t>
+        <w:t xml:space="preserve">[x] Domain modeli, DTO, adapter, API servis, State i Facade</w:t>
+      </w:r>
+    </w:p>
+    <w:p>
+      <w:pPr>
+        <w:pStyle w:val="ListParagraph"/>
+        <w:numPr>
+          <w:ilvl w:val="0"/>
+          <w:numId w:val="1"/>
+        </w:numPr>
+      </w:pPr>
+      <w:r>
+        <w:t xml:space="preserve">[x] TrainingList prikaz, query state i akcije kroz WorkoutFacade/WorkoutState</w:t>
+      </w:r>
+    </w:p>
+    <w:p>
+      <w:pPr>
+        <w:pStyle w:val="ListParagraph"/>
+        <w:numPr>
+          <w:ilvl w:val="0"/>
+          <w:numId w:val="1"/>
+        </w:numPr>
+      </w:pPr>
+      <w:r>
+        <w:t xml:space="preserve">[x] TrainingForm create/update kroz WorkoutFacade</w:t>
+      </w:r>
+    </w:p>
+    <w:p>
+      <w:pPr>
+        <w:pStyle w:val="ListParagraph"/>
+        <w:numPr>
+          <w:ilvl w:val="0"/>
+          <w:numId w:val="1"/>
+        </w:numPr>
+      </w:pPr>
+      <w:r>
+        <w:t xml:space="preserve">[ ] Ukloniti poslednji legacy bridge za edit formu</w:t>
       </w:r>
     </w:p>
     <w:p>

</xml_diff>

<commit_message>
refactor: migrate training form to workout domain.
</commit_message>
<xml_diff>
--- a/MODERNIZATION_PROGRESS.docx
+++ b/MODERNIZATION_PROGRESS.docx
@@ -510,6 +510,18 @@
     </w:p>
     <w:p>
       <w:pPr>
+        <w:pStyle w:val="ListParagraph"/>
+        <w:numPr>
+          <w:ilvl w:val="0"/>
+          <w:numId w:val="1"/>
+        </w:numPr>
+      </w:pPr>
+      <w:r>
+        <w:t xml:space="preserve">[x] TrainingForm koristi Workout domain model bez Training bridge-a</w:t>
+      </w:r>
+    </w:p>
+    <w:p>
+      <w:pPr>
         <w:pStyle w:val="Heading1"/>
       </w:pPr>
       <w:r>

</xml_diff>

<commit_message>
docs: update modernization progress report
</commit_message>
<xml_diff>
--- a/MODERNIZATION_PROGRESS.docx
+++ b/MODERNIZATION_PROGRESS.docx
@@ -339,7 +339,7 @@
         <w:tc>
           <w:p>
             <w:r>
-              <w:t xml:space="preserve">WorkoutState, query state i WorkoutFacade business flow postoje</w:t>
+              <w:t xml:space="preserve">WorkoutState, query state, Facade i UI integracija postoje</w:t>
             </w:r>
           </w:p>
         </w:tc>
@@ -518,6 +518,18 @@
       </w:pPr>
       <w:r>
         <w:t xml:space="preserve">[x] TrainingForm koristi Workout domain model bez Training bridge-a</w:t>
+      </w:r>
+    </w:p>
+    <w:p>
+      <w:pPr>
+        <w:pStyle w:val="ListParagraph"/>
+        <w:numPr>
+          <w:ilvl w:val="0"/>
+          <w:numId w:val="1"/>
+        </w:numPr>
+      </w:pPr>
+      <w:r>
+        <w:t xml:space="preserve">[x] TrainingList i TrainingForm integracija sa Facade/State slojem</w:t>
       </w:r>
     </w:p>
     <w:p>

</xml_diff>

<commit_message>
docs: add bidirectional workout data flow diagrams.
</commit_message>
<xml_diff>
--- a/MODERNIZATION_PROGRESS.docx
+++ b/MODERNIZATION_PROGRESS.docx
@@ -151,6 +151,62 @@
         <w:pStyle w:val="Heading1"/>
       </w:pPr>
       <w:r>
+        <w:t xml:space="preserve">Workout data flow</w:t>
+      </w:r>
+    </w:p>
+    <w:p>
+      <w:r>
+        <w:drawing>
+          <wp:inline distT="0" distB="0" distL="0" distR="0">
+            <wp:extent cx="6191250" cy="2028825"/>
+            <wp:effectExtent t="0" r="0" b="0" l="0"/>
+            <wp:docPr id="1" name="" descr="" title=""/>
+            <wp:cNvGraphicFramePr>
+              <a:graphicFrameLocks xmlns:a="http://schemas.openxmlformats.org/drawingml/2006/main" noChangeAspect="1"/>
+            </wp:cNvGraphicFramePr>
+            <a:graphic xmlns:a="http://schemas.openxmlformats.org/drawingml/2006/main">
+              <a:graphicData uri="http://schemas.openxmlformats.org/drawingml/2006/picture">
+                <pic:pic xmlns:pic="http://schemas.openxmlformats.org/drawingml/2006/picture">
+                  <pic:nvPicPr>
+                    <pic:cNvPr id="0" name="" descr=""/>
+                    <pic:cNvPicPr>
+                      <a:picLocks noChangeAspect="1" noChangeArrowheads="1"/>
+                    </pic:cNvPicPr>
+                  </pic:nvPicPr>
+                  <pic:blipFill>
+                    <a:blip r:embed="rId8" cstate="none">
+                      <a:extLst>
+                        <a:ext uri="{96DAC541-7B7A-43D3-8B79-37D633B846F1}">
+                          <asvg:svgBlip xmlns:asvg="http://schemas.microsoft.com/office/drawing/2016/SVG/main" r:embed="rId10"/>
+                        </a:ext>
+                      </a:extLst>
+                    </a:blip>
+                    <a:srcRect/>
+                    <a:stretch>
+                      <a:fillRect/>
+                    </a:stretch>
+                  </pic:blipFill>
+                  <pic:spPr bwMode="auto">
+                    <a:xfrm>
+                      <a:off x="0" y="0"/>
+                      <a:ext cx="6191250" cy="2028825"/>
+                    </a:xfrm>
+                    <a:prstGeom prst="rect">
+                      <a:avLst/>
+                    </a:prstGeom>
+                  </pic:spPr>
+                </pic:pic>
+              </a:graphicData>
+            </a:graphic>
+          </wp:inline>
+        </w:drawing>
+      </w:r>
+    </w:p>
+    <w:p>
+      <w:pPr>
+        <w:pStyle w:val="Heading1"/>
+      </w:pPr>
+      <w:r>
         <w:t xml:space="preserve">Status po planu</w:t>
       </w:r>
     </w:p>

</xml_diff>